<commit_message>
Upload format guide: essay type and an enumeration + essay sample
Co-Authored-By: Claude Opus 5.5 <noreply@anthropic.com>
Claude-Session: https://claude.ai/code/session_0149wWQGjm3zcsYE54GPZ83L
</commit_message>
<xml_diff>
--- a/docs/Accounthink-Question-Upload-Format.docx
+++ b/docs/Accounthink-Question-Upload-Format.docx
@@ -97,7 +97,7 @@
           <w:sz w:val="21"/>
           <w:szCs w:val="21"/>
         </w:rPr>
-        <w:t xml:space="preserve">Pages 2–3 are ready-to-paste samples. Copy only the part between the green dashed lines.</w:t>
+        <w:t xml:space="preserve">Pages 2–4 are ready-to-paste samples. Copy only the part between the green dashed lines.</w:t>
       </w:r>
     </w:p>
     <w:p>
@@ -147,8 +147,8 @@
       <w:r>
         <w:rPr>
           <w:rFonts w:ascii="Consolas" w:cs="Consolas" w:eastAsia="Consolas" w:hAnsi="Consolas"/>
-          <w:sz w:val="19"/>
-          <w:szCs w:val="19"/>
+          <w:sz w:val="16"/>
+          <w:szCs w:val="16"/>
         </w:rPr>
         <w:t xml:space="preserve">1.</w:t>
       </w:r>
@@ -163,8 +163,8 @@
       <w:r>
         <w:rPr>
           <w:rFonts w:ascii="Consolas" w:cs="Consolas" w:eastAsia="Consolas" w:hAnsi="Consolas"/>
-          <w:sz w:val="19"/>
-          <w:szCs w:val="19"/>
+          <w:sz w:val="16"/>
+          <w:szCs w:val="16"/>
         </w:rPr>
         <w:t xml:space="preserve">1)</w:t>
       </w:r>
@@ -199,8 +199,8 @@
       <w:r>
         <w:rPr>
           <w:rFonts w:ascii="Consolas" w:cs="Consolas" w:eastAsia="Consolas" w:hAnsi="Consolas"/>
-          <w:sz w:val="19"/>
-          <w:szCs w:val="19"/>
+          <w:sz w:val="16"/>
+          <w:szCs w:val="16"/>
         </w:rPr>
         <w:t xml:space="preserve">A.</w:t>
       </w:r>
@@ -215,8 +215,8 @@
       <w:r>
         <w:rPr>
           <w:rFonts w:ascii="Consolas" w:cs="Consolas" w:eastAsia="Consolas" w:hAnsi="Consolas"/>
-          <w:sz w:val="19"/>
-          <w:szCs w:val="19"/>
+          <w:sz w:val="16"/>
+          <w:szCs w:val="16"/>
         </w:rPr>
         <w:t xml:space="preserve">F.</w:t>
       </w:r>
@@ -231,8 +231,8 @@
       <w:r>
         <w:rPr>
           <w:rFonts w:ascii="Consolas" w:cs="Consolas" w:eastAsia="Consolas" w:hAnsi="Consolas"/>
-          <w:sz w:val="19"/>
-          <w:szCs w:val="19"/>
+          <w:sz w:val="16"/>
+          <w:szCs w:val="16"/>
         </w:rPr>
         <w:t xml:space="preserve">a)</w:t>
       </w:r>
@@ -247,8 +247,8 @@
       <w:r>
         <w:rPr>
           <w:rFonts w:ascii="Consolas" w:cs="Consolas" w:eastAsia="Consolas" w:hAnsi="Consolas"/>
-          <w:sz w:val="19"/>
-          <w:szCs w:val="19"/>
+          <w:sz w:val="16"/>
+          <w:szCs w:val="16"/>
         </w:rPr>
         <w:t xml:space="preserve">A. Cash   B. Revenue   C. Expense</w:t>
       </w:r>
@@ -291,8 +291,8 @@
       <w:r>
         <w:rPr>
           <w:rFonts w:ascii="Consolas" w:cs="Consolas" w:eastAsia="Consolas" w:hAnsi="Consolas"/>
-          <w:sz w:val="19"/>
-          <w:szCs w:val="19"/>
+          <w:sz w:val="16"/>
+          <w:szCs w:val="16"/>
         </w:rPr>
         <w:t xml:space="preserve">ANSWER:</w:t>
       </w:r>
@@ -307,8 +307,8 @@
       <w:r>
         <w:rPr>
           <w:rFonts w:ascii="Consolas" w:cs="Consolas" w:eastAsia="Consolas" w:hAnsi="Consolas"/>
-          <w:sz w:val="19"/>
-          <w:szCs w:val="19"/>
+          <w:sz w:val="16"/>
+          <w:szCs w:val="16"/>
         </w:rPr>
         <w:t xml:space="preserve">ANSWER KEY</w:t>
       </w:r>
@@ -351,8 +351,8 @@
       <w:r>
         <w:rPr>
           <w:rFonts w:ascii="Consolas" w:cs="Consolas" w:eastAsia="Consolas" w:hAnsi="Consolas"/>
-          <w:sz w:val="19"/>
-          <w:szCs w:val="19"/>
+          <w:sz w:val="16"/>
+          <w:szCs w:val="16"/>
         </w:rPr>
         <w:t xml:space="preserve">;</w:t>
       </w:r>
@@ -362,7 +362,41 @@
           <w:sz w:val="21"/>
           <w:szCs w:val="21"/>
         </w:rPr>
-        <w:t xml:space="preserve"> make it Enumeration.</w:t>
+        <w:t xml:space="preserve"> make it Enumeration. </w:t>
+      </w:r>
+      <w:r>
+        <w:rPr>
+          <w:rFonts w:ascii="Calibri" w:cs="Calibri" w:eastAsia="Calibri" w:hAnsi="Calibri"/>
+          <w:b/>
+          <w:bCs/>
+          <w:sz w:val="21"/>
+          <w:szCs w:val="21"/>
+        </w:rPr>
+        <w:t xml:space="preserve">Essays</w:t>
+      </w:r>
+      <w:r>
+        <w:rPr>
+          <w:rFonts w:ascii="Calibri" w:cs="Calibri" w:eastAsia="Calibri" w:hAnsi="Calibri"/>
+          <w:sz w:val="21"/>
+          <w:szCs w:val="21"/>
+        </w:rPr>
+        <w:t xml:space="preserve"> need a line </w:t>
+      </w:r>
+      <w:r>
+        <w:rPr>
+          <w:rFonts w:ascii="Consolas" w:cs="Consolas" w:eastAsia="Consolas" w:hAnsi="Consolas"/>
+          <w:sz w:val="16"/>
+          <w:szCs w:val="16"/>
+        </w:rPr>
+        <w:t xml:space="preserve">TYPE: Essay</w:t>
+      </w:r>
+      <w:r>
+        <w:rPr>
+          <w:rFonts w:ascii="Calibri" w:cs="Calibri" w:eastAsia="Calibri" w:hAnsi="Calibri"/>
+          <w:sz w:val="21"/>
+          <w:szCs w:val="21"/>
+        </w:rPr>
+        <w:t xml:space="preserve">.</w:t>
       </w:r>
     </w:p>
     <w:p>
@@ -395,9 +429,9 @@
         </w:tblBorders>
       </w:tblPr>
       <w:tblGrid>
-        <w:gridCol w:w="2000"/>
-        <w:gridCol w:w="3500"/>
-        <w:gridCol w:w="4580"/>
+        <w:gridCol w:w="1600"/>
+        <w:gridCol w:w="4300"/>
+        <w:gridCol w:w="4180"/>
       </w:tblGrid>
       <w:tr>
         <w:trPr>
@@ -405,7 +439,7 @@
         </w:trPr>
         <w:tc>
           <w:tcPr>
-            <w:tcW w:type="dxa" w:w="2000"/>
+            <w:tcW w:type="dxa" w:w="1600"/>
             <w:tcBorders>
               <w:top w:val="single" w:color="CBD5E1" w:sz="4"/>
               <w:left w:val="single" w:color="CBD5E1" w:sz="4"/>
@@ -426,8 +460,8 @@
                 <w:rFonts w:ascii="Calibri" w:cs="Calibri" w:eastAsia="Calibri" w:hAnsi="Calibri"/>
                 <w:b/>
                 <w:bCs/>
-                <w:sz w:val="20"/>
-                <w:szCs w:val="20"/>
+                <w:sz w:val="18"/>
+                <w:szCs w:val="18"/>
               </w:rPr>
               <w:t xml:space="preserve">Type</w:t>
             </w:r>
@@ -435,7 +469,7 @@
         </w:tc>
         <w:tc>
           <w:tcPr>
-            <w:tcW w:type="dxa" w:w="3500"/>
+            <w:tcW w:type="dxa" w:w="4300"/>
             <w:tcBorders>
               <w:top w:val="single" w:color="CBD5E1" w:sz="4"/>
               <w:left w:val="single" w:color="CBD5E1" w:sz="4"/>
@@ -456,8 +490,8 @@
                 <w:rFonts w:ascii="Calibri" w:cs="Calibri" w:eastAsia="Calibri" w:hAnsi="Calibri"/>
                 <w:b/>
                 <w:bCs/>
-                <w:sz w:val="20"/>
-                <w:szCs w:val="20"/>
+                <w:sz w:val="18"/>
+                <w:szCs w:val="18"/>
               </w:rPr>
               <w:t xml:space="preserve">Write it like this</w:t>
             </w:r>
@@ -465,7 +499,7 @@
         </w:tc>
         <w:tc>
           <w:tcPr>
-            <w:tcW w:type="dxa" w:w="4580"/>
+            <w:tcW w:type="dxa" w:w="4180"/>
             <w:tcBorders>
               <w:top w:val="single" w:color="CBD5E1" w:sz="4"/>
               <w:left w:val="single" w:color="CBD5E1" w:sz="4"/>
@@ -486,8 +520,8 @@
                 <w:rFonts w:ascii="Calibri" w:cs="Calibri" w:eastAsia="Calibri" w:hAnsi="Calibri"/>
                 <w:b/>
                 <w:bCs/>
-                <w:sz w:val="20"/>
-                <w:szCs w:val="20"/>
+                <w:sz w:val="18"/>
+                <w:szCs w:val="18"/>
               </w:rPr>
               <w:t xml:space="preserve">Notes</w:t>
             </w:r>
@@ -500,7 +534,7 @@
         </w:trPr>
         <w:tc>
           <w:tcPr>
-            <w:tcW w:type="dxa" w:w="2000"/>
+            <w:tcW w:type="dxa" w:w="1600"/>
             <w:tcBorders>
               <w:top w:val="single" w:color="CBD5E1" w:sz="4"/>
               <w:left w:val="single" w:color="CBD5E1" w:sz="4"/>
@@ -520,8 +554,8 @@
                 <w:rFonts w:ascii="Calibri" w:cs="Calibri" w:eastAsia="Calibri" w:hAnsi="Calibri"/>
                 <w:b w:val="false"/>
                 <w:bCs w:val="false"/>
-                <w:sz w:val="20"/>
-                <w:szCs w:val="20"/>
+                <w:sz w:val="18"/>
+                <w:szCs w:val="18"/>
               </w:rPr>
               <w:t xml:space="preserve">Multiple choice</w:t>
             </w:r>
@@ -529,7 +563,7 @@
         </w:tc>
         <w:tc>
           <w:tcPr>
-            <w:tcW w:type="dxa" w:w="3500"/>
+            <w:tcW w:type="dxa" w:w="4300"/>
             <w:tcBorders>
               <w:top w:val="single" w:color="CBD5E1" w:sz="4"/>
               <w:left w:val="single" w:color="CBD5E1" w:sz="4"/>
@@ -547,8 +581,8 @@
             <w:r>
               <w:rPr>
                 <w:rFonts w:ascii="Consolas" w:cs="Consolas" w:eastAsia="Consolas" w:hAnsi="Consolas"/>
-                <w:sz w:val="19"/>
-                <w:szCs w:val="19"/>
+                <w:sz w:val="16"/>
+                <w:szCs w:val="16"/>
               </w:rPr>
               <w:t xml:space="preserve">1. Which is an asset?</w:t>
             </w:r>
@@ -557,8 +591,8 @@
             <w:r>
               <w:rPr>
                 <w:rFonts w:ascii="Consolas" w:cs="Consolas" w:eastAsia="Consolas" w:hAnsi="Consolas"/>
-                <w:sz w:val="19"/>
-                <w:szCs w:val="19"/>
+                <w:sz w:val="16"/>
+                <w:szCs w:val="16"/>
               </w:rPr>
               <w:t xml:space="preserve">A. Revenue</w:t>
             </w:r>
@@ -567,8 +601,8 @@
             <w:r>
               <w:rPr>
                 <w:rFonts w:ascii="Consolas" w:cs="Consolas" w:eastAsia="Consolas" w:hAnsi="Consolas"/>
-                <w:sz w:val="19"/>
-                <w:szCs w:val="19"/>
+                <w:sz w:val="16"/>
+                <w:szCs w:val="16"/>
               </w:rPr>
               <w:t xml:space="preserve">B. Cash</w:t>
             </w:r>
@@ -577,8 +611,8 @@
             <w:r>
               <w:rPr>
                 <w:rFonts w:ascii="Consolas" w:cs="Consolas" w:eastAsia="Consolas" w:hAnsi="Consolas"/>
-                <w:sz w:val="19"/>
-                <w:szCs w:val="19"/>
+                <w:sz w:val="16"/>
+                <w:szCs w:val="16"/>
               </w:rPr>
               <w:t xml:space="preserve">C. Expense</w:t>
             </w:r>
@@ -587,8 +621,8 @@
             <w:r>
               <w:rPr>
                 <w:rFonts w:ascii="Consolas" w:cs="Consolas" w:eastAsia="Consolas" w:hAnsi="Consolas"/>
-                <w:sz w:val="19"/>
-                <w:szCs w:val="19"/>
+                <w:sz w:val="16"/>
+                <w:szCs w:val="16"/>
               </w:rPr>
               <w:t xml:space="preserve">ANSWER: B</w:t>
             </w:r>
@@ -596,7 +630,7 @@
         </w:tc>
         <w:tc>
           <w:tcPr>
-            <w:tcW w:type="dxa" w:w="4580"/>
+            <w:tcW w:type="dxa" w:w="4180"/>
             <w:tcBorders>
               <w:top w:val="single" w:color="CBD5E1" w:sz="4"/>
               <w:left w:val="single" w:color="CBD5E1" w:sz="4"/>
@@ -616,16 +650,16 @@
                 <w:rFonts w:ascii="Calibri" w:cs="Calibri" w:eastAsia="Calibri" w:hAnsi="Calibri"/>
                 <w:b w:val="false"/>
                 <w:bCs w:val="false"/>
-                <w:sz w:val="20"/>
-                <w:szCs w:val="20"/>
+                <w:sz w:val="18"/>
+                <w:szCs w:val="18"/>
               </w:rPr>
               <w:t xml:space="preserve">Answer with the letter. Or put </w:t>
             </w:r>
             <w:r>
               <w:rPr>
                 <w:rFonts w:ascii="Consolas" w:cs="Consolas" w:eastAsia="Consolas" w:hAnsi="Consolas"/>
-                <w:sz w:val="19"/>
-                <w:szCs w:val="19"/>
+                <w:sz w:val="16"/>
+                <w:szCs w:val="16"/>
               </w:rPr>
               <w:t xml:space="preserve">*</w:t>
             </w:r>
@@ -634,16 +668,16 @@
                 <w:rFonts w:ascii="Calibri" w:cs="Calibri" w:eastAsia="Calibri" w:hAnsi="Calibri"/>
                 <w:b w:val="false"/>
                 <w:bCs w:val="false"/>
-                <w:sz w:val="20"/>
-                <w:szCs w:val="20"/>
+                <w:sz w:val="18"/>
+                <w:szCs w:val="18"/>
               </w:rPr>
               <w:t xml:space="preserve"> before the correct choice (</w:t>
             </w:r>
             <w:r>
               <w:rPr>
                 <w:rFonts w:ascii="Consolas" w:cs="Consolas" w:eastAsia="Consolas" w:hAnsi="Consolas"/>
-                <w:sz w:val="19"/>
-                <w:szCs w:val="19"/>
+                <w:sz w:val="16"/>
+                <w:szCs w:val="16"/>
               </w:rPr>
               <w:t xml:space="preserve">*B. Cash</w:t>
             </w:r>
@@ -652,8 +686,8 @@
                 <w:rFonts w:ascii="Calibri" w:cs="Calibri" w:eastAsia="Calibri" w:hAnsi="Calibri"/>
                 <w:b w:val="false"/>
                 <w:bCs w:val="false"/>
-                <w:sz w:val="20"/>
-                <w:szCs w:val="20"/>
+                <w:sz w:val="18"/>
+                <w:szCs w:val="18"/>
               </w:rPr>
               <w:t xml:space="preserve">) and skip the ANSWER line. Up to 6 choices (A–F). “All/None of the above” always stays last when choices are shuffled.</w:t>
             </w:r>
@@ -666,7 +700,7 @@
         </w:trPr>
         <w:tc>
           <w:tcPr>
-            <w:tcW w:type="dxa" w:w="2000"/>
+            <w:tcW w:type="dxa" w:w="1600"/>
             <w:tcBorders>
               <w:top w:val="single" w:color="CBD5E1" w:sz="4"/>
               <w:left w:val="single" w:color="CBD5E1" w:sz="4"/>
@@ -686,8 +720,8 @@
                 <w:rFonts w:ascii="Calibri" w:cs="Calibri" w:eastAsia="Calibri" w:hAnsi="Calibri"/>
                 <w:b w:val="false"/>
                 <w:bCs w:val="false"/>
-                <w:sz w:val="20"/>
-                <w:szCs w:val="20"/>
+                <w:sz w:val="18"/>
+                <w:szCs w:val="18"/>
               </w:rPr>
               <w:t xml:space="preserve">Identification</w:t>
             </w:r>
@@ -695,7 +729,7 @@
         </w:tc>
         <w:tc>
           <w:tcPr>
-            <w:tcW w:type="dxa" w:w="3500"/>
+            <w:tcW w:type="dxa" w:w="4300"/>
             <w:tcBorders>
               <w:top w:val="single" w:color="CBD5E1" w:sz="4"/>
               <w:left w:val="single" w:color="CBD5E1" w:sz="4"/>
@@ -713,46 +747,46 @@
             <w:r>
               <w:rPr>
                 <w:rFonts w:ascii="Consolas" w:cs="Consolas" w:eastAsia="Consolas" w:hAnsi="Consolas"/>
-                <w:sz w:val="19"/>
-                <w:szCs w:val="19"/>
-              </w:rPr>
-              <w:t xml:space="preserve">2. The assumption that the</w:t>
+                <w:sz w:val="16"/>
+                <w:szCs w:val="16"/>
+              </w:rPr>
+              <w:t xml:space="preserve">2. The assumption that the entity</w:t>
             </w:r>
           </w:p>
           <w:p>
             <w:r>
               <w:rPr>
                 <w:rFonts w:ascii="Consolas" w:cs="Consolas" w:eastAsia="Consolas" w:hAnsi="Consolas"/>
-                <w:sz w:val="19"/>
-                <w:szCs w:val="19"/>
-              </w:rPr>
-              <w:t xml:space="preserve">entity will continue operating.</w:t>
+                <w:sz w:val="16"/>
+                <w:szCs w:val="16"/>
+              </w:rPr>
+              <w:t xml:space="preserve">will continue operating.</w:t>
             </w:r>
           </w:p>
           <w:p>
             <w:r>
               <w:rPr>
                 <w:rFonts w:ascii="Consolas" w:cs="Consolas" w:eastAsia="Consolas" w:hAnsi="Consolas"/>
-                <w:sz w:val="19"/>
-                <w:szCs w:val="19"/>
-              </w:rPr>
-              <w:t xml:space="preserve">ANSWER: Going concern / Going</w:t>
+                <w:sz w:val="16"/>
+                <w:szCs w:val="16"/>
+              </w:rPr>
+              <w:t xml:space="preserve">ANSWER: Going concern / Going concern</w:t>
             </w:r>
           </w:p>
           <w:p>
             <w:r>
               <w:rPr>
                 <w:rFonts w:ascii="Consolas" w:cs="Consolas" w:eastAsia="Consolas" w:hAnsi="Consolas"/>
-                <w:sz w:val="19"/>
-                <w:szCs w:val="19"/>
-              </w:rPr>
-              <w:t xml:space="preserve">concern assumption</w:t>
+                <w:sz w:val="16"/>
+                <w:szCs w:val="16"/>
+              </w:rPr>
+              <w:t xml:space="preserve">assumption</w:t>
             </w:r>
           </w:p>
         </w:tc>
         <w:tc>
           <w:tcPr>
-            <w:tcW w:type="dxa" w:w="4580"/>
+            <w:tcW w:type="dxa" w:w="4180"/>
             <w:tcBorders>
               <w:top w:val="single" w:color="CBD5E1" w:sz="4"/>
               <w:left w:val="single" w:color="CBD5E1" w:sz="4"/>
@@ -772,16 +806,16 @@
                 <w:rFonts w:ascii="Calibri" w:cs="Calibri" w:eastAsia="Calibri" w:hAnsi="Calibri"/>
                 <w:b w:val="false"/>
                 <w:bCs w:val="false"/>
-                <w:sz w:val="20"/>
-                <w:szCs w:val="20"/>
+                <w:sz w:val="18"/>
+                <w:szCs w:val="18"/>
               </w:rPr>
               <w:t xml:space="preserve">Separate other accepted wordings with </w:t>
             </w:r>
             <w:r>
               <w:rPr>
                 <w:rFonts w:ascii="Consolas" w:cs="Consolas" w:eastAsia="Consolas" w:hAnsi="Consolas"/>
-                <w:sz w:val="19"/>
-                <w:szCs w:val="19"/>
+                <w:sz w:val="16"/>
+                <w:szCs w:val="16"/>
               </w:rPr>
               <w:t xml:space="preserve">/</w:t>
             </w:r>
@@ -790,8 +824,8 @@
                 <w:rFonts w:ascii="Calibri" w:cs="Calibri" w:eastAsia="Calibri" w:hAnsi="Calibri"/>
                 <w:b w:val="false"/>
                 <w:bCs w:val="false"/>
-                <w:sz w:val="20"/>
-                <w:szCs w:val="20"/>
+                <w:sz w:val="18"/>
+                <w:szCs w:val="18"/>
               </w:rPr>
               <w:t xml:space="preserve">. Grading ignores capital letters, extra spaces and a final period, so “going concern.” is correct.</w:t>
             </w:r>
@@ -804,7 +838,7 @@
         </w:trPr>
         <w:tc>
           <w:tcPr>
-            <w:tcW w:type="dxa" w:w="2000"/>
+            <w:tcW w:type="dxa" w:w="1600"/>
             <w:tcBorders>
               <w:top w:val="single" w:color="CBD5E1" w:sz="4"/>
               <w:left w:val="single" w:color="CBD5E1" w:sz="4"/>
@@ -824,8 +858,8 @@
                 <w:rFonts w:ascii="Calibri" w:cs="Calibri" w:eastAsia="Calibri" w:hAnsi="Calibri"/>
                 <w:b w:val="false"/>
                 <w:bCs w:val="false"/>
-                <w:sz w:val="20"/>
-                <w:szCs w:val="20"/>
+                <w:sz w:val="18"/>
+                <w:szCs w:val="18"/>
               </w:rPr>
               <w:t xml:space="preserve">Enumeration</w:t>
             </w:r>
@@ -833,7 +867,7 @@
         </w:tc>
         <w:tc>
           <w:tcPr>
-            <w:tcW w:type="dxa" w:w="3500"/>
+            <w:tcW w:type="dxa" w:w="4300"/>
             <w:tcBorders>
               <w:top w:val="single" w:color="CBD5E1" w:sz="4"/>
               <w:left w:val="single" w:color="CBD5E1" w:sz="4"/>
@@ -851,8 +885,8 @@
             <w:r>
               <w:rPr>
                 <w:rFonts w:ascii="Consolas" w:cs="Consolas" w:eastAsia="Consolas" w:hAnsi="Consolas"/>
-                <w:sz w:val="19"/>
-                <w:szCs w:val="19"/>
+                <w:sz w:val="16"/>
+                <w:szCs w:val="16"/>
               </w:rPr>
               <w:t xml:space="preserve">3. Give three current assets.</w:t>
             </w:r>
@@ -861,26 +895,26 @@
             <w:r>
               <w:rPr>
                 <w:rFonts w:ascii="Consolas" w:cs="Consolas" w:eastAsia="Consolas" w:hAnsi="Consolas"/>
-                <w:sz w:val="19"/>
-                <w:szCs w:val="19"/>
-              </w:rPr>
-              <w:t xml:space="preserve">ANSWER: Cash; Receivables /</w:t>
+                <w:sz w:val="16"/>
+                <w:szCs w:val="16"/>
+              </w:rPr>
+              <w:t xml:space="preserve">ANSWER: Cash; Receivables / Accounts</w:t>
             </w:r>
           </w:p>
           <w:p>
             <w:r>
               <w:rPr>
                 <w:rFonts w:ascii="Consolas" w:cs="Consolas" w:eastAsia="Consolas" w:hAnsi="Consolas"/>
-                <w:sz w:val="19"/>
-                <w:szCs w:val="19"/>
-              </w:rPr>
-              <w:t xml:space="preserve">Accounts receivable; Inventory</w:t>
+                <w:sz w:val="16"/>
+                <w:szCs w:val="16"/>
+              </w:rPr>
+              <w:t xml:space="preserve">receivable; Inventory</w:t>
             </w:r>
           </w:p>
         </w:tc>
         <w:tc>
           <w:tcPr>
-            <w:tcW w:type="dxa" w:w="4580"/>
+            <w:tcW w:type="dxa" w:w="4180"/>
             <w:tcBorders>
               <w:top w:val="single" w:color="CBD5E1" w:sz="4"/>
               <w:left w:val="single" w:color="CBD5E1" w:sz="4"/>
@@ -900,16 +934,16 @@
                 <w:rFonts w:ascii="Calibri" w:cs="Calibri" w:eastAsia="Calibri" w:hAnsi="Calibri"/>
                 <w:b w:val="false"/>
                 <w:bCs w:val="false"/>
-                <w:sz w:val="20"/>
-                <w:szCs w:val="20"/>
+                <w:sz w:val="18"/>
+                <w:szCs w:val="18"/>
               </w:rPr>
               <w:t xml:space="preserve">One answer per </w:t>
             </w:r>
             <w:r>
               <w:rPr>
                 <w:rFonts w:ascii="Consolas" w:cs="Consolas" w:eastAsia="Consolas" w:hAnsi="Consolas"/>
-                <w:sz w:val="19"/>
-                <w:szCs w:val="19"/>
+                <w:sz w:val="16"/>
+                <w:szCs w:val="16"/>
               </w:rPr>
               <w:t xml:space="preserve">;</w:t>
             </w:r>
@@ -918,16 +952,16 @@
                 <w:rFonts w:ascii="Calibri" w:cs="Calibri" w:eastAsia="Calibri" w:hAnsi="Calibri"/>
                 <w:b w:val="false"/>
                 <w:bCs w:val="false"/>
-                <w:sz w:val="20"/>
-                <w:szCs w:val="20"/>
+                <w:sz w:val="18"/>
+                <w:szCs w:val="18"/>
               </w:rPr>
               <w:t xml:space="preserve"> — worth 1 point each. Alternate wordings with </w:t>
             </w:r>
             <w:r>
               <w:rPr>
                 <w:rFonts w:ascii="Consolas" w:cs="Consolas" w:eastAsia="Consolas" w:hAnsi="Consolas"/>
-                <w:sz w:val="19"/>
-                <w:szCs w:val="19"/>
+                <w:sz w:val="16"/>
+                <w:szCs w:val="16"/>
               </w:rPr>
               <w:t xml:space="preserve">/</w:t>
             </w:r>
@@ -936,16 +970,16 @@
                 <w:rFonts w:ascii="Calibri" w:cs="Calibri" w:eastAsia="Calibri" w:hAnsi="Calibri"/>
                 <w:b w:val="false"/>
                 <w:bCs w:val="false"/>
-                <w:sz w:val="20"/>
-                <w:szCs w:val="20"/>
+                <w:sz w:val="18"/>
+                <w:szCs w:val="18"/>
               </w:rPr>
               <w:t xml:space="preserve">. Any order is accepted; write </w:t>
             </w:r>
             <w:r>
               <w:rPr>
                 <w:rFonts w:ascii="Consolas" w:cs="Consolas" w:eastAsia="Consolas" w:hAnsi="Consolas"/>
-                <w:sz w:val="19"/>
-                <w:szCs w:val="19"/>
+                <w:sz w:val="16"/>
+                <w:szCs w:val="16"/>
               </w:rPr>
               <w:t xml:space="preserve">ANSWER: IN ORDER: …</w:t>
             </w:r>
@@ -954,10 +988,186 @@
                 <w:rFonts w:ascii="Calibri" w:cs="Calibri" w:eastAsia="Calibri" w:hAnsi="Calibri"/>
                 <w:b w:val="false"/>
                 <w:bCs w:val="false"/>
-                <w:sz w:val="20"/>
-                <w:szCs w:val="20"/>
+                <w:sz w:val="18"/>
+                <w:szCs w:val="18"/>
               </w:rPr>
               <w:t xml:space="preserve"> if order matters.</w:t>
+            </w:r>
+          </w:p>
+        </w:tc>
+      </w:tr>
+      <w:tr>
+        <w:trPr>
+          <w:tblHeader w:val="false"/>
+        </w:trPr>
+        <w:tc>
+          <w:tcPr>
+            <w:tcW w:type="dxa" w:w="1600"/>
+            <w:tcBorders>
+              <w:top w:val="single" w:color="CBD5E1" w:sz="4"/>
+              <w:left w:val="single" w:color="CBD5E1" w:sz="4"/>
+              <w:bottom w:val="single" w:color="CBD5E1" w:sz="4"/>
+              <w:right w:val="single" w:color="CBD5E1" w:sz="4"/>
+            </w:tcBorders>
+            <w:tcMar>
+              <w:top w:type="dxa" w:w="80"/>
+              <w:left w:type="dxa" w:w="120"/>
+              <w:bottom w:type="dxa" w:w="80"/>
+              <w:right w:type="dxa" w:w="120"/>
+            </w:tcMar>
+          </w:tcPr>
+          <w:p>
+            <w:r>
+              <w:rPr>
+                <w:rFonts w:ascii="Calibri" w:cs="Calibri" w:eastAsia="Calibri" w:hAnsi="Calibri"/>
+                <w:b w:val="false"/>
+                <w:bCs w:val="false"/>
+                <w:sz w:val="18"/>
+                <w:szCs w:val="18"/>
+              </w:rPr>
+              <w:t xml:space="preserve">Essay</w:t>
+            </w:r>
+          </w:p>
+        </w:tc>
+        <w:tc>
+          <w:tcPr>
+            <w:tcW w:type="dxa" w:w="4300"/>
+            <w:tcBorders>
+              <w:top w:val="single" w:color="CBD5E1" w:sz="4"/>
+              <w:left w:val="single" w:color="CBD5E1" w:sz="4"/>
+              <w:bottom w:val="single" w:color="CBD5E1" w:sz="4"/>
+              <w:right w:val="single" w:color="CBD5E1" w:sz="4"/>
+            </w:tcBorders>
+            <w:tcMar>
+              <w:top w:type="dxa" w:w="80"/>
+              <w:left w:type="dxa" w:w="120"/>
+              <w:bottom w:type="dxa" w:w="80"/>
+              <w:right w:type="dxa" w:w="120"/>
+            </w:tcMar>
+          </w:tcPr>
+          <w:p>
+            <w:r>
+              <w:rPr>
+                <w:rFonts w:ascii="Consolas" w:cs="Consolas" w:eastAsia="Consolas" w:hAnsi="Consolas"/>
+                <w:sz w:val="16"/>
+                <w:szCs w:val="16"/>
+              </w:rPr>
+              <w:t xml:space="preserve">4. Explain the going concern assumption.</w:t>
+            </w:r>
+          </w:p>
+          <w:p>
+            <w:r>
+              <w:rPr>
+                <w:rFonts w:ascii="Consolas" w:cs="Consolas" w:eastAsia="Consolas" w:hAnsi="Consolas"/>
+                <w:sz w:val="16"/>
+                <w:szCs w:val="16"/>
+              </w:rPr>
+              <w:t xml:space="preserve">TYPE: Essay</w:t>
+            </w:r>
+          </w:p>
+          <w:p>
+            <w:r>
+              <w:rPr>
+                <w:rFonts w:ascii="Consolas" w:cs="Consolas" w:eastAsia="Consolas" w:hAnsi="Consolas"/>
+                <w:sz w:val="16"/>
+                <w:szCs w:val="16"/>
+              </w:rPr>
+              <w:t xml:space="preserve">POINTS: 5</w:t>
+            </w:r>
+          </w:p>
+          <w:p>
+            <w:r>
+              <w:rPr>
+                <w:rFonts w:ascii="Consolas" w:cs="Consolas" w:eastAsia="Consolas" w:hAnsi="Consolas"/>
+                <w:sz w:val="16"/>
+                <w:szCs w:val="16"/>
+              </w:rPr>
+              <w:t xml:space="preserve">ANSWER: Entity continues; assets at cost</w:t>
+            </w:r>
+          </w:p>
+        </w:tc>
+        <w:tc>
+          <w:tcPr>
+            <w:tcW w:type="dxa" w:w="4180"/>
+            <w:tcBorders>
+              <w:top w:val="single" w:color="CBD5E1" w:sz="4"/>
+              <w:left w:val="single" w:color="CBD5E1" w:sz="4"/>
+              <w:bottom w:val="single" w:color="CBD5E1" w:sz="4"/>
+              <w:right w:val="single" w:color="CBD5E1" w:sz="4"/>
+            </w:tcBorders>
+            <w:tcMar>
+              <w:top w:type="dxa" w:w="80"/>
+              <w:left w:type="dxa" w:w="120"/>
+              <w:bottom w:type="dxa" w:w="80"/>
+              <w:right w:type="dxa" w:w="120"/>
+            </w:tcMar>
+          </w:tcPr>
+          <w:p>
+            <w:r>
+              <w:rPr>
+                <w:rFonts w:ascii="Calibri" w:cs="Calibri" w:eastAsia="Calibri" w:hAnsi="Calibri"/>
+                <w:b w:val="false"/>
+                <w:bCs w:val="false"/>
+                <w:sz w:val="18"/>
+                <w:szCs w:val="18"/>
+              </w:rPr>
+              <w:t xml:space="preserve">Needs </w:t>
+            </w:r>
+            <w:r>
+              <w:rPr>
+                <w:rFonts w:ascii="Consolas" w:cs="Consolas" w:eastAsia="Consolas" w:hAnsi="Consolas"/>
+                <w:sz w:val="16"/>
+                <w:szCs w:val="16"/>
+              </w:rPr>
+              <w:t xml:space="preserve">TYPE: Essay</w:t>
+            </w:r>
+            <w:r>
+              <w:rPr>
+                <w:rFonts w:ascii="Calibri" w:cs="Calibri" w:eastAsia="Calibri" w:hAnsi="Calibri"/>
+                <w:b w:val="false"/>
+                <w:bCs w:val="false"/>
+                <w:sz w:val="18"/>
+                <w:szCs w:val="18"/>
+              </w:rPr>
+              <w:t xml:space="preserve">. 5 points unless you add </w:t>
+            </w:r>
+            <w:r>
+              <w:rPr>
+                <w:rFonts w:ascii="Consolas" w:cs="Consolas" w:eastAsia="Consolas" w:hAnsi="Consolas"/>
+                <w:sz w:val="16"/>
+                <w:szCs w:val="16"/>
+              </w:rPr>
+              <w:t xml:space="preserve">POINTS:</w:t>
+            </w:r>
+            <w:r>
+              <w:rPr>
+                <w:rFonts w:ascii="Calibri" w:cs="Calibri" w:eastAsia="Calibri" w:hAnsi="Calibri"/>
+                <w:b w:val="false"/>
+                <w:bCs w:val="false"/>
+                <w:sz w:val="18"/>
+                <w:szCs w:val="18"/>
+              </w:rPr>
+              <w:t xml:space="preserve">. The ANSWER line is optional: it is your guide when checking and is never shown during the exam. Essays are checked by you in </w:t>
+            </w:r>
+            <w:r>
+              <w:rPr>
+                <w:rFonts w:ascii="Calibri" w:cs="Calibri" w:eastAsia="Calibri" w:hAnsi="Calibri"/>
+                <w:b/>
+                <w:bCs/>
+                <w:sz w:val="21"/>
+                <w:szCs w:val="21"/>
+              </w:rPr>
+              <w:t xml:space="preserve">Exam → Check answers</w:t>
+            </w:r>
+            <w:r>
+              <w:rPr>
+                <w:rFonts w:ascii="Calibri" w:cs="Calibri" w:eastAsia="Calibri" w:hAnsi="Calibri"/>
+                <w:b w:val="false"/>
+                <w:bCs w:val="false"/>
+                <w:sz w:val="18"/>
+                <w:szCs w:val="18"/>
+              </w:rPr>
+              <w:t xml:space="preserve">.</w:t>
             </w:r>
           </w:p>
         </w:tc>
@@ -993,8 +1203,8 @@
         </w:tblBorders>
       </w:tblPr>
       <w:tblGrid>
-        <w:gridCol w:w="2600"/>
-        <w:gridCol w:w="7480"/>
+        <w:gridCol w:w="2900"/>
+        <w:gridCol w:w="7180"/>
       </w:tblGrid>
       <w:tr>
         <w:trPr>
@@ -1002,7 +1212,7 @@
         </w:trPr>
         <w:tc>
           <w:tcPr>
-            <w:tcW w:type="dxa" w:w="2600"/>
+            <w:tcW w:type="dxa" w:w="2900"/>
             <w:tcBorders>
               <w:top w:val="single" w:color="CBD5E1" w:sz="4"/>
               <w:left w:val="single" w:color="CBD5E1" w:sz="4"/>
@@ -1023,8 +1233,8 @@
                 <w:rFonts w:ascii="Calibri" w:cs="Calibri" w:eastAsia="Calibri" w:hAnsi="Calibri"/>
                 <w:b/>
                 <w:bCs/>
-                <w:sz w:val="20"/>
-                <w:szCs w:val="20"/>
+                <w:sz w:val="18"/>
+                <w:szCs w:val="18"/>
               </w:rPr>
               <w:t xml:space="preserve">Line</w:t>
             </w:r>
@@ -1032,7 +1242,7 @@
         </w:tc>
         <w:tc>
           <w:tcPr>
-            <w:tcW w:type="dxa" w:w="7480"/>
+            <w:tcW w:type="dxa" w:w="7180"/>
             <w:tcBorders>
               <w:top w:val="single" w:color="CBD5E1" w:sz="4"/>
               <w:left w:val="single" w:color="CBD5E1" w:sz="4"/>
@@ -1053,8 +1263,8 @@
                 <w:rFonts w:ascii="Calibri" w:cs="Calibri" w:eastAsia="Calibri" w:hAnsi="Calibri"/>
                 <w:b/>
                 <w:bCs/>
-                <w:sz w:val="20"/>
-                <w:szCs w:val="20"/>
+                <w:sz w:val="18"/>
+                <w:szCs w:val="18"/>
               </w:rPr>
               <w:t xml:space="preserve">What it does</w:t>
             </w:r>
@@ -1067,7 +1277,7 @@
         </w:trPr>
         <w:tc>
           <w:tcPr>
-            <w:tcW w:type="dxa" w:w="2600"/>
+            <w:tcW w:type="dxa" w:w="2900"/>
             <w:tcBorders>
               <w:top w:val="single" w:color="CBD5E1" w:sz="4"/>
               <w:left w:val="single" w:color="CBD5E1" w:sz="4"/>
@@ -1085,8 +1295,8 @@
             <w:r>
               <w:rPr>
                 <w:rFonts w:ascii="Consolas" w:cs="Consolas" w:eastAsia="Consolas" w:hAnsi="Consolas"/>
-                <w:sz w:val="19"/>
-                <w:szCs w:val="19"/>
+                <w:sz w:val="16"/>
+                <w:szCs w:val="16"/>
               </w:rPr>
               <w:t xml:space="preserve">TOPIC: Audit evidence</w:t>
             </w:r>
@@ -1094,7 +1304,7 @@
         </w:tc>
         <w:tc>
           <w:tcPr>
-            <w:tcW w:type="dxa" w:w="7480"/>
+            <w:tcW w:type="dxa" w:w="7180"/>
             <w:tcBorders>
               <w:top w:val="single" w:color="CBD5E1" w:sz="4"/>
               <w:left w:val="single" w:color="CBD5E1" w:sz="4"/>
@@ -1114,8 +1324,8 @@
                 <w:rFonts w:ascii="Calibri" w:cs="Calibri" w:eastAsia="Calibri" w:hAnsi="Calibri"/>
                 <w:b w:val="false"/>
                 <w:bCs w:val="false"/>
-                <w:sz w:val="20"/>
-                <w:szCs w:val="20"/>
+                <w:sz w:val="18"/>
+                <w:szCs w:val="18"/>
               </w:rPr>
               <w:t xml:space="preserve">Groups questions for filtering and item analysis. You can also set one topic for the whole paste on the Import screen.</w:t>
             </w:r>
@@ -1128,7 +1338,7 @@
         </w:trPr>
         <w:tc>
           <w:tcPr>
-            <w:tcW w:type="dxa" w:w="2600"/>
+            <w:tcW w:type="dxa" w:w="2900"/>
             <w:tcBorders>
               <w:top w:val="single" w:color="CBD5E1" w:sz="4"/>
               <w:left w:val="single" w:color="CBD5E1" w:sz="4"/>
@@ -1146,8 +1356,8 @@
             <w:r>
               <w:rPr>
                 <w:rFonts w:ascii="Consolas" w:cs="Consolas" w:eastAsia="Consolas" w:hAnsi="Consolas"/>
-                <w:sz w:val="19"/>
-                <w:szCs w:val="19"/>
+                <w:sz w:val="16"/>
+                <w:szCs w:val="16"/>
               </w:rPr>
               <w:t xml:space="preserve">DIFFICULTY: Easy</w:t>
             </w:r>
@@ -1155,7 +1365,7 @@
         </w:tc>
         <w:tc>
           <w:tcPr>
-            <w:tcW w:type="dxa" w:w="7480"/>
+            <w:tcW w:type="dxa" w:w="7180"/>
             <w:tcBorders>
               <w:top w:val="single" w:color="CBD5E1" w:sz="4"/>
               <w:left w:val="single" w:color="CBD5E1" w:sz="4"/>
@@ -1175,16 +1385,16 @@
                 <w:rFonts w:ascii="Calibri" w:cs="Calibri" w:eastAsia="Calibri" w:hAnsi="Calibri"/>
                 <w:b w:val="false"/>
                 <w:bCs w:val="false"/>
-                <w:sz w:val="20"/>
-                <w:szCs w:val="20"/>
+                <w:sz w:val="18"/>
+                <w:szCs w:val="18"/>
               </w:rPr>
               <w:t xml:space="preserve">Easy, Average or Difficult (also accepts Medium, Hard, E/A/D). </w:t>
             </w:r>
             <w:r>
               <w:rPr>
                 <w:rFonts w:ascii="Consolas" w:cs="Consolas" w:eastAsia="Consolas" w:hAnsi="Consolas"/>
-                <w:sz w:val="19"/>
-                <w:szCs w:val="19"/>
+                <w:sz w:val="16"/>
+                <w:szCs w:val="16"/>
               </w:rPr>
               <w:t xml:space="preserve">LEVEL:</w:t>
             </w:r>
@@ -1193,8 +1403,8 @@
                 <w:rFonts w:ascii="Calibri" w:cs="Calibri" w:eastAsia="Calibri" w:hAnsi="Calibri"/>
                 <w:b w:val="false"/>
                 <w:bCs w:val="false"/>
-                <w:sz w:val="20"/>
-                <w:szCs w:val="20"/>
+                <w:sz w:val="18"/>
+                <w:szCs w:val="18"/>
               </w:rPr>
               <w:t xml:space="preserve"> works too.</w:t>
             </w:r>
@@ -1207,7 +1417,7 @@
         </w:trPr>
         <w:tc>
           <w:tcPr>
-            <w:tcW w:type="dxa" w:w="2600"/>
+            <w:tcW w:type="dxa" w:w="2900"/>
             <w:tcBorders>
               <w:top w:val="single" w:color="CBD5E1" w:sz="4"/>
               <w:left w:val="single" w:color="CBD5E1" w:sz="4"/>
@@ -1225,8 +1435,8 @@
             <w:r>
               <w:rPr>
                 <w:rFonts w:ascii="Consolas" w:cs="Consolas" w:eastAsia="Consolas" w:hAnsi="Consolas"/>
-                <w:sz w:val="19"/>
-                <w:szCs w:val="19"/>
+                <w:sz w:val="16"/>
+                <w:szCs w:val="16"/>
               </w:rPr>
               <w:t xml:space="preserve">POINTS: 2</w:t>
             </w:r>
@@ -1234,7 +1444,7 @@
         </w:tc>
         <w:tc>
           <w:tcPr>
-            <w:tcW w:type="dxa" w:w="7480"/>
+            <w:tcW w:type="dxa" w:w="7180"/>
             <w:tcBorders>
               <w:top w:val="single" w:color="CBD5E1" w:sz="4"/>
               <w:left w:val="single" w:color="CBD5E1" w:sz="4"/>
@@ -1254,10 +1464,10 @@
                 <w:rFonts w:ascii="Calibri" w:cs="Calibri" w:eastAsia="Calibri" w:hAnsi="Calibri"/>
                 <w:b w:val="false"/>
                 <w:bCs w:val="false"/>
-                <w:sz w:val="20"/>
-                <w:szCs w:val="20"/>
-              </w:rPr>
-              <w:t xml:space="preserve">Points for this question (default 1). Enumeration is always 1 point per answer.</w:t>
+                <w:sz w:val="18"/>
+                <w:szCs w:val="18"/>
+              </w:rPr>
+              <w:t xml:space="preserve">Points for this question (default 1; essays 5). Enumeration is always 1 point per answer.</w:t>
             </w:r>
           </w:p>
         </w:tc>
@@ -1268,7 +1478,7 @@
         </w:trPr>
         <w:tc>
           <w:tcPr>
-            <w:tcW w:type="dxa" w:w="2600"/>
+            <w:tcW w:type="dxa" w:w="2900"/>
             <w:tcBorders>
               <w:top w:val="single" w:color="CBD5E1" w:sz="4"/>
               <w:left w:val="single" w:color="CBD5E1" w:sz="4"/>
@@ -1286,16 +1496,16 @@
             <w:r>
               <w:rPr>
                 <w:rFonts w:ascii="Consolas" w:cs="Consolas" w:eastAsia="Consolas" w:hAnsi="Consolas"/>
-                <w:sz w:val="19"/>
-                <w:szCs w:val="19"/>
-              </w:rPr>
-              <w:t xml:space="preserve">TYPE: Identification</w:t>
+                <w:sz w:val="16"/>
+                <w:szCs w:val="16"/>
+              </w:rPr>
+              <w:t xml:space="preserve">TYPE: Essay</w:t>
             </w:r>
           </w:p>
         </w:tc>
         <w:tc>
           <w:tcPr>
-            <w:tcW w:type="dxa" w:w="7480"/>
+            <w:tcW w:type="dxa" w:w="7180"/>
             <w:tcBorders>
               <w:top w:val="single" w:color="CBD5E1" w:sz="4"/>
               <w:left w:val="single" w:color="CBD5E1" w:sz="4"/>
@@ -1315,10 +1525,10 @@
                 <w:rFonts w:ascii="Calibri" w:cs="Calibri" w:eastAsia="Calibri" w:hAnsi="Calibri"/>
                 <w:b w:val="false"/>
                 <w:bCs w:val="false"/>
-                <w:sz w:val="20"/>
-                <w:szCs w:val="20"/>
-              </w:rPr>
-              <w:t xml:space="preserve">Only needed to force a type; normally it is worked out for you.</w:t>
+                <w:sz w:val="18"/>
+                <w:szCs w:val="18"/>
+              </w:rPr>
+              <w:t xml:space="preserve">Required for essays. For other types it is only needed to force a type (MCQ, Identification, Enumeration); normally it is worked out for you.</w:t>
             </w:r>
           </w:p>
         </w:tc>
@@ -1361,8 +1571,8 @@
       <w:r>
         <w:rPr>
           <w:rFonts w:ascii="Consolas" w:cs="Consolas" w:eastAsia="Consolas" w:hAnsi="Consolas"/>
-          <w:sz w:val="19"/>
-          <w:szCs w:val="19"/>
+          <w:sz w:val="16"/>
+          <w:szCs w:val="16"/>
         </w:rPr>
         <w:t xml:space="preserve">I.</w:t>
       </w:r>
@@ -1377,8 +1587,8 @@
       <w:r>
         <w:rPr>
           <w:rFonts w:ascii="Consolas" w:cs="Consolas" w:eastAsia="Consolas" w:hAnsi="Consolas"/>
-          <w:sz w:val="19"/>
-          <w:szCs w:val="19"/>
+          <w:sz w:val="16"/>
+          <w:szCs w:val="16"/>
         </w:rPr>
         <w:t xml:space="preserve">II.</w:t>
       </w:r>
@@ -1411,8 +1621,8 @@
       <w:r>
         <w:rPr>
           <w:rFonts w:ascii="Consolas" w:cs="Consolas" w:eastAsia="Consolas" w:hAnsi="Consolas"/>
-          <w:sz w:val="19"/>
-          <w:szCs w:val="19"/>
+          <w:sz w:val="16"/>
+          <w:szCs w:val="16"/>
         </w:rPr>
         <w:t xml:space="preserve">2.</w:t>
       </w:r>
@@ -2581,6 +2791,664 @@
           <w:szCs w:val="21"/>
         </w:rPr>
         <w:t xml:space="preserve">Tip: a question without an entry in the key shows in the preview as “No answer”, so nothing is imported by mistake.</w:t>
+      </w:r>
+    </w:p>
+    <w:p>
+      <w:r>
+        <w:br w:type="page"/>
+      </w:r>
+    </w:p>
+    <w:p>
+      <w:pPr>
+        <w:pStyle w:val="Heading1"/>
+        <w:spacing w:after="100" w:before="240"/>
+      </w:pPr>
+      <w:r>
+        <w:rPr>
+          <w:rFonts w:ascii="Calibri" w:cs="Calibri" w:eastAsia="Calibri" w:hAnsi="Calibri"/>
+          <w:b/>
+          <w:bCs/>
+          <w:color w:val="047857"/>
+          <w:sz w:val="28"/>
+          <w:szCs w:val="28"/>
+        </w:rPr>
+        <w:t xml:space="preserve">Sample 3 — enumeration and essay</w:t>
+      </w:r>
+    </w:p>
+    <w:p>
+      <w:pPr>
+        <w:spacing w:after="80"/>
+      </w:pPr>
+      <w:r>
+        <w:rPr>
+          <w:rFonts w:ascii="Calibri" w:cs="Calibri" w:eastAsia="Calibri" w:hAnsi="Calibri"/>
+          <w:b/>
+          <w:bCs/>
+          <w:sz w:val="21"/>
+          <w:szCs w:val="21"/>
+        </w:rPr>
+        <w:t xml:space="preserve">Imports 7 questions: </w:t>
+      </w:r>
+      <w:r>
+        <w:rPr>
+          <w:rFonts w:ascii="Calibri" w:cs="Calibri" w:eastAsia="Calibri" w:hAnsi="Calibri"/>
+          <w:sz w:val="21"/>
+          <w:szCs w:val="21"/>
+        </w:rPr>
+        <w:t xml:space="preserve">4 enumeration (4, 2, 3 and 4 points; the last must be in order) and 3 essays (5 and 10 points with a checking guide; the last one has no guide and gets the default 5 points).</w:t>
+      </w:r>
+    </w:p>
+    <w:p>
+      <w:pPr>
+        <w:spacing w:after="80"/>
+      </w:pPr>
+      <w:r>
+        <w:rPr>
+          <w:rFonts w:ascii="Calibri" w:cs="Calibri" w:eastAsia="Calibri" w:hAnsi="Calibri"/>
+          <w:sz w:val="21"/>
+          <w:szCs w:val="21"/>
+        </w:rPr>
+        <w:t xml:space="preserve">Enumeration is graded automatically. Essays show as “to check” until you score them in Exam → Check answers; students see their final score and your comment after that.</w:t>
+      </w:r>
+    </w:p>
+    <w:p>
+      <w:pPr>
+        <w:pBdr>
+          <w:bottom w:val="dashed" w:color="047857" w:sz="6" w:space="4"/>
+        </w:pBdr>
+        <w:spacing w:after="160" w:before="200"/>
+      </w:pPr>
+      <w:r>
+        <w:rPr>
+          <w:rFonts w:ascii="Calibri" w:cs="Calibri" w:eastAsia="Calibri" w:hAnsi="Calibri"/>
+          <w:b/>
+          <w:bCs/>
+          <w:color w:val="047857"/>
+          <w:sz w:val="18"/>
+          <w:szCs w:val="18"/>
+        </w:rPr>
+        <w:t xml:space="preserve">✂  COPY FROM HERE</w:t>
+      </w:r>
+    </w:p>
+    <w:p>
+      <w:pPr>
+        <w:spacing w:after="0" w:line="259"/>
+      </w:pPr>
+      <w:r>
+        <w:rPr>
+          <w:rFonts w:ascii="Calibri" w:cs="Calibri" w:eastAsia="Calibri" w:hAnsi="Calibri"/>
+          <w:sz w:val="21"/>
+          <w:szCs w:val="21"/>
+        </w:rPr>
+        <w:t xml:space="preserve">1. Give the four basic financial statements.</w:t>
+      </w:r>
+    </w:p>
+    <w:p>
+      <w:pPr>
+        <w:spacing w:after="0" w:line="259"/>
+      </w:pPr>
+      <w:r>
+        <w:rPr>
+          <w:rFonts w:ascii="Calibri" w:cs="Calibri" w:eastAsia="Calibri" w:hAnsi="Calibri"/>
+          <w:sz w:val="21"/>
+          <w:szCs w:val="21"/>
+        </w:rPr>
+        <w:t xml:space="preserve">ANSWER: Statement of financial position / Balance sheet; Statement of comprehensive income / Income statement; Statement of changes in equity; Statement of cash flows</w:t>
+      </w:r>
+    </w:p>
+    <w:p>
+      <w:pPr>
+        <w:spacing w:after="0" w:line="259"/>
+      </w:pPr>
+      <w:r>
+        <w:rPr>
+          <w:rFonts w:ascii="Calibri" w:cs="Calibri" w:eastAsia="Calibri" w:hAnsi="Calibri"/>
+          <w:sz w:val="21"/>
+          <w:szCs w:val="21"/>
+        </w:rPr>
+        <w:t xml:space="preserve">TOPIC: Financial statements</w:t>
+      </w:r>
+    </w:p>
+    <w:p>
+      <w:pPr>
+        <w:spacing w:after="0" w:line="259"/>
+      </w:pPr>
+      <w:r>
+        <w:rPr>
+          <w:rFonts w:ascii="Calibri" w:cs="Calibri" w:eastAsia="Calibri" w:hAnsi="Calibri"/>
+          <w:sz w:val="21"/>
+          <w:szCs w:val="21"/>
+        </w:rPr>
+        <w:t xml:space="preserve">DIFFICULTY: Easy</w:t>
+      </w:r>
+    </w:p>
+    <w:p>
+      <w:pPr>
+        <w:spacing w:after="0" w:line="200"/>
+      </w:pPr>
+      <w:r>
+        <w:rPr>
+          <w:sz w:val="14"/>
+          <w:szCs w:val="14"/>
+        </w:rPr>
+        <w:t xml:space="preserve"/>
+      </w:r>
+    </w:p>
+    <w:p>
+      <w:pPr>
+        <w:spacing w:after="0" w:line="259"/>
+      </w:pPr>
+      <w:r>
+        <w:rPr>
+          <w:rFonts w:ascii="Calibri" w:cs="Calibri" w:eastAsia="Calibri" w:hAnsi="Calibri"/>
+          <w:sz w:val="21"/>
+          <w:szCs w:val="21"/>
+        </w:rPr>
+        <w:t xml:space="preserve">2. Give the two fundamental qualitative characteristics of useful financial information.</w:t>
+      </w:r>
+    </w:p>
+    <w:p>
+      <w:pPr>
+        <w:spacing w:after="0" w:line="259"/>
+      </w:pPr>
+      <w:r>
+        <w:rPr>
+          <w:rFonts w:ascii="Calibri" w:cs="Calibri" w:eastAsia="Calibri" w:hAnsi="Calibri"/>
+          <w:sz w:val="21"/>
+          <w:szCs w:val="21"/>
+        </w:rPr>
+        <w:t xml:space="preserve">ANSWER: Relevance; Faithful representation</w:t>
+      </w:r>
+    </w:p>
+    <w:p>
+      <w:pPr>
+        <w:spacing w:after="0" w:line="259"/>
+      </w:pPr>
+      <w:r>
+        <w:rPr>
+          <w:rFonts w:ascii="Calibri" w:cs="Calibri" w:eastAsia="Calibri" w:hAnsi="Calibri"/>
+          <w:sz w:val="21"/>
+          <w:szCs w:val="21"/>
+        </w:rPr>
+        <w:t xml:space="preserve">TOPIC: Conceptual framework</w:t>
+      </w:r>
+    </w:p>
+    <w:p>
+      <w:pPr>
+        <w:spacing w:after="0" w:line="259"/>
+      </w:pPr>
+      <w:r>
+        <w:rPr>
+          <w:rFonts w:ascii="Calibri" w:cs="Calibri" w:eastAsia="Calibri" w:hAnsi="Calibri"/>
+          <w:sz w:val="21"/>
+          <w:szCs w:val="21"/>
+        </w:rPr>
+        <w:t xml:space="preserve">DIFFICULTY: Average</w:t>
+      </w:r>
+    </w:p>
+    <w:p>
+      <w:pPr>
+        <w:spacing w:after="0" w:line="200"/>
+      </w:pPr>
+      <w:r>
+        <w:rPr>
+          <w:sz w:val="14"/>
+          <w:szCs w:val="14"/>
+        </w:rPr>
+        <w:t xml:space="preserve"/>
+      </w:r>
+    </w:p>
+    <w:p>
+      <w:pPr>
+        <w:spacing w:after="0" w:line="259"/>
+      </w:pPr>
+      <w:r>
+        <w:rPr>
+          <w:rFonts w:ascii="Calibri" w:cs="Calibri" w:eastAsia="Calibri" w:hAnsi="Calibri"/>
+          <w:sz w:val="21"/>
+          <w:szCs w:val="21"/>
+        </w:rPr>
+        <w:t xml:space="preserve">3. Give the components of audit risk.</w:t>
+      </w:r>
+    </w:p>
+    <w:p>
+      <w:pPr>
+        <w:spacing w:after="0" w:line="259"/>
+      </w:pPr>
+      <w:r>
+        <w:rPr>
+          <w:rFonts w:ascii="Calibri" w:cs="Calibri" w:eastAsia="Calibri" w:hAnsi="Calibri"/>
+          <w:sz w:val="21"/>
+          <w:szCs w:val="21"/>
+        </w:rPr>
+        <w:t xml:space="preserve">ANSWER: Inherent risk; Control risk; Detection risk</w:t>
+      </w:r>
+    </w:p>
+    <w:p>
+      <w:pPr>
+        <w:spacing w:after="0" w:line="259"/>
+      </w:pPr>
+      <w:r>
+        <w:rPr>
+          <w:rFonts w:ascii="Calibri" w:cs="Calibri" w:eastAsia="Calibri" w:hAnsi="Calibri"/>
+          <w:sz w:val="21"/>
+          <w:szCs w:val="21"/>
+        </w:rPr>
+        <w:t xml:space="preserve">TOPIC: Audit risk</w:t>
+      </w:r>
+    </w:p>
+    <w:p>
+      <w:pPr>
+        <w:spacing w:after="0" w:line="259"/>
+      </w:pPr>
+      <w:r>
+        <w:rPr>
+          <w:rFonts w:ascii="Calibri" w:cs="Calibri" w:eastAsia="Calibri" w:hAnsi="Calibri"/>
+          <w:sz w:val="21"/>
+          <w:szCs w:val="21"/>
+        </w:rPr>
+        <w:t xml:space="preserve">DIFFICULTY: Average</w:t>
+      </w:r>
+    </w:p>
+    <w:p>
+      <w:pPr>
+        <w:spacing w:after="0" w:line="200"/>
+      </w:pPr>
+      <w:r>
+        <w:rPr>
+          <w:sz w:val="14"/>
+          <w:szCs w:val="14"/>
+        </w:rPr>
+        <w:t xml:space="preserve"/>
+      </w:r>
+    </w:p>
+    <w:p>
+      <w:pPr>
+        <w:spacing w:after="0" w:line="259"/>
+      </w:pPr>
+      <w:r>
+        <w:rPr>
+          <w:rFonts w:ascii="Calibri" w:cs="Calibri" w:eastAsia="Calibri" w:hAnsi="Calibri"/>
+          <w:sz w:val="21"/>
+          <w:szCs w:val="21"/>
+        </w:rPr>
+        <w:t xml:space="preserve">4. Give the steps of the accounting cycle up to the trial balance, in order.</w:t>
+      </w:r>
+    </w:p>
+    <w:p>
+      <w:pPr>
+        <w:spacing w:after="0" w:line="259"/>
+      </w:pPr>
+      <w:r>
+        <w:rPr>
+          <w:rFonts w:ascii="Calibri" w:cs="Calibri" w:eastAsia="Calibri" w:hAnsi="Calibri"/>
+          <w:sz w:val="21"/>
+          <w:szCs w:val="21"/>
+        </w:rPr>
+        <w:t xml:space="preserve">ANSWER: IN ORDER: Analyze transactions; Journalize; Post to the ledger; Prepare a trial balance</w:t>
+      </w:r>
+    </w:p>
+    <w:p>
+      <w:pPr>
+        <w:spacing w:after="0" w:line="259"/>
+      </w:pPr>
+      <w:r>
+        <w:rPr>
+          <w:rFonts w:ascii="Calibri" w:cs="Calibri" w:eastAsia="Calibri" w:hAnsi="Calibri"/>
+          <w:sz w:val="21"/>
+          <w:szCs w:val="21"/>
+        </w:rPr>
+        <w:t xml:space="preserve">TOPIC: Accounting cycle</w:t>
+      </w:r>
+    </w:p>
+    <w:p>
+      <w:pPr>
+        <w:spacing w:after="0" w:line="259"/>
+      </w:pPr>
+      <w:r>
+        <w:rPr>
+          <w:rFonts w:ascii="Calibri" w:cs="Calibri" w:eastAsia="Calibri" w:hAnsi="Calibri"/>
+          <w:sz w:val="21"/>
+          <w:szCs w:val="21"/>
+        </w:rPr>
+        <w:t xml:space="preserve">DIFFICULTY: Difficult</w:t>
+      </w:r>
+    </w:p>
+    <w:p>
+      <w:pPr>
+        <w:spacing w:after="0" w:line="200"/>
+      </w:pPr>
+      <w:r>
+        <w:rPr>
+          <w:sz w:val="14"/>
+          <w:szCs w:val="14"/>
+        </w:rPr>
+        <w:t xml:space="preserve"/>
+      </w:r>
+    </w:p>
+    <w:p>
+      <w:pPr>
+        <w:spacing w:after="0" w:line="259"/>
+      </w:pPr>
+      <w:r>
+        <w:rPr>
+          <w:rFonts w:ascii="Calibri" w:cs="Calibri" w:eastAsia="Calibri" w:hAnsi="Calibri"/>
+          <w:sz w:val="21"/>
+          <w:szCs w:val="21"/>
+        </w:rPr>
+        <w:t xml:space="preserve">5. Explain the going concern assumption and give one effect it has on how assets are measured.</w:t>
+      </w:r>
+    </w:p>
+    <w:p>
+      <w:pPr>
+        <w:spacing w:after="0" w:line="259"/>
+      </w:pPr>
+      <w:r>
+        <w:rPr>
+          <w:rFonts w:ascii="Calibri" w:cs="Calibri" w:eastAsia="Calibri" w:hAnsi="Calibri"/>
+          <w:sz w:val="21"/>
+          <w:szCs w:val="21"/>
+        </w:rPr>
+        <w:t xml:space="preserve">TYPE: Essay</w:t>
+      </w:r>
+    </w:p>
+    <w:p>
+      <w:pPr>
+        <w:spacing w:after="0" w:line="259"/>
+      </w:pPr>
+      <w:r>
+        <w:rPr>
+          <w:rFonts w:ascii="Calibri" w:cs="Calibri" w:eastAsia="Calibri" w:hAnsi="Calibri"/>
+          <w:sz w:val="21"/>
+          <w:szCs w:val="21"/>
+        </w:rPr>
+        <w:t xml:space="preserve">POINTS: 5</w:t>
+      </w:r>
+    </w:p>
+    <w:p>
+      <w:pPr>
+        <w:spacing w:after="0" w:line="259"/>
+      </w:pPr>
+      <w:r>
+        <w:rPr>
+          <w:rFonts w:ascii="Calibri" w:cs="Calibri" w:eastAsia="Calibri" w:hAnsi="Calibri"/>
+          <w:sz w:val="21"/>
+          <w:szCs w:val="21"/>
+        </w:rPr>
+        <w:t xml:space="preserve">ANSWER: Entity will continue operating for the foreseeable future; assets are carried at cost, not at liquidation values</w:t>
+      </w:r>
+    </w:p>
+    <w:p>
+      <w:pPr>
+        <w:spacing w:after="0" w:line="259"/>
+      </w:pPr>
+      <w:r>
+        <w:rPr>
+          <w:rFonts w:ascii="Calibri" w:cs="Calibri" w:eastAsia="Calibri" w:hAnsi="Calibri"/>
+          <w:sz w:val="21"/>
+          <w:szCs w:val="21"/>
+        </w:rPr>
+        <w:t xml:space="preserve">TOPIC: Conceptual framework</w:t>
+      </w:r>
+    </w:p>
+    <w:p>
+      <w:pPr>
+        <w:spacing w:after="0" w:line="259"/>
+      </w:pPr>
+      <w:r>
+        <w:rPr>
+          <w:rFonts w:ascii="Calibri" w:cs="Calibri" w:eastAsia="Calibri" w:hAnsi="Calibri"/>
+          <w:sz w:val="21"/>
+          <w:szCs w:val="21"/>
+        </w:rPr>
+        <w:t xml:space="preserve">DIFFICULTY: Average</w:t>
+      </w:r>
+    </w:p>
+    <w:p>
+      <w:pPr>
+        <w:spacing w:after="0" w:line="200"/>
+      </w:pPr>
+      <w:r>
+        <w:rPr>
+          <w:sz w:val="14"/>
+          <w:szCs w:val="14"/>
+        </w:rPr>
+        <w:t xml:space="preserve"/>
+      </w:r>
+    </w:p>
+    <w:p>
+      <w:pPr>
+        <w:spacing w:after="0" w:line="259"/>
+      </w:pPr>
+      <w:r>
+        <w:rPr>
+          <w:rFonts w:ascii="Calibri" w:cs="Calibri" w:eastAsia="Calibri" w:hAnsi="Calibri"/>
+          <w:sz w:val="21"/>
+          <w:szCs w:val="21"/>
+        </w:rPr>
+        <w:t xml:space="preserve">6. Distinguish between error and fraud in a financial statement audit. Give one example of each.</w:t>
+      </w:r>
+    </w:p>
+    <w:p>
+      <w:pPr>
+        <w:spacing w:after="0" w:line="259"/>
+      </w:pPr>
+      <w:r>
+        <w:rPr>
+          <w:rFonts w:ascii="Calibri" w:cs="Calibri" w:eastAsia="Calibri" w:hAnsi="Calibri"/>
+          <w:sz w:val="21"/>
+          <w:szCs w:val="21"/>
+        </w:rPr>
+        <w:t xml:space="preserve">TYPE: Essay</w:t>
+      </w:r>
+    </w:p>
+    <w:p>
+      <w:pPr>
+        <w:spacing w:after="0" w:line="259"/>
+      </w:pPr>
+      <w:r>
+        <w:rPr>
+          <w:rFonts w:ascii="Calibri" w:cs="Calibri" w:eastAsia="Calibri" w:hAnsi="Calibri"/>
+          <w:sz w:val="21"/>
+          <w:szCs w:val="21"/>
+        </w:rPr>
+        <w:t xml:space="preserve">POINTS: 10</w:t>
+      </w:r>
+    </w:p>
+    <w:p>
+      <w:pPr>
+        <w:spacing w:after="0" w:line="259"/>
+      </w:pPr>
+      <w:r>
+        <w:rPr>
+          <w:rFonts w:ascii="Calibri" w:cs="Calibri" w:eastAsia="Calibri" w:hAnsi="Calibri"/>
+          <w:sz w:val="21"/>
+          <w:szCs w:val="21"/>
+        </w:rPr>
+        <w:t xml:space="preserve">ANSWER: Error is unintentional, fraud is intentional; example of error: mathematical mistake; example of fraud: fictitious sales</w:t>
+      </w:r>
+    </w:p>
+    <w:p>
+      <w:pPr>
+        <w:spacing w:after="0" w:line="259"/>
+      </w:pPr>
+      <w:r>
+        <w:rPr>
+          <w:rFonts w:ascii="Calibri" w:cs="Calibri" w:eastAsia="Calibri" w:hAnsi="Calibri"/>
+          <w:sz w:val="21"/>
+          <w:szCs w:val="21"/>
+        </w:rPr>
+        <w:t xml:space="preserve">TOPIC: Audit evidence</w:t>
+      </w:r>
+    </w:p>
+    <w:p>
+      <w:pPr>
+        <w:spacing w:after="0" w:line="259"/>
+      </w:pPr>
+      <w:r>
+        <w:rPr>
+          <w:rFonts w:ascii="Calibri" w:cs="Calibri" w:eastAsia="Calibri" w:hAnsi="Calibri"/>
+          <w:sz w:val="21"/>
+          <w:szCs w:val="21"/>
+        </w:rPr>
+        <w:t xml:space="preserve">DIFFICULTY: Difficult</w:t>
+      </w:r>
+    </w:p>
+    <w:p>
+      <w:pPr>
+        <w:spacing w:after="0" w:line="200"/>
+      </w:pPr>
+      <w:r>
+        <w:rPr>
+          <w:sz w:val="14"/>
+          <w:szCs w:val="14"/>
+        </w:rPr>
+        <w:t xml:space="preserve"/>
+      </w:r>
+    </w:p>
+    <w:p>
+      <w:pPr>
+        <w:spacing w:after="0" w:line="259"/>
+      </w:pPr>
+      <w:r>
+        <w:rPr>
+          <w:rFonts w:ascii="Calibri" w:cs="Calibri" w:eastAsia="Calibri" w:hAnsi="Calibri"/>
+          <w:sz w:val="21"/>
+          <w:szCs w:val="21"/>
+        </w:rPr>
+        <w:t xml:space="preserve">7. In your own words, why is independence important to an external auditor?</w:t>
+      </w:r>
+    </w:p>
+    <w:p>
+      <w:pPr>
+        <w:spacing w:after="0" w:line="259"/>
+      </w:pPr>
+      <w:r>
+        <w:rPr>
+          <w:rFonts w:ascii="Calibri" w:cs="Calibri" w:eastAsia="Calibri" w:hAnsi="Calibri"/>
+          <w:sz w:val="21"/>
+          <w:szCs w:val="21"/>
+        </w:rPr>
+        <w:t xml:space="preserve">TYPE: Essay</w:t>
+      </w:r>
+    </w:p>
+    <w:p>
+      <w:pPr>
+        <w:spacing w:after="0" w:line="259"/>
+      </w:pPr>
+      <w:r>
+        <w:rPr>
+          <w:rFonts w:ascii="Calibri" w:cs="Calibri" w:eastAsia="Calibri" w:hAnsi="Calibri"/>
+          <w:sz w:val="21"/>
+          <w:szCs w:val="21"/>
+        </w:rPr>
+        <w:t xml:space="preserve">TOPIC: Professional ethics</w:t>
+      </w:r>
+    </w:p>
+    <w:p>
+      <w:pPr>
+        <w:pBdr>
+          <w:bottom w:val="dashed" w:color="047857" w:sz="6" w:space="4"/>
+        </w:pBdr>
+        <w:spacing w:after="160" w:before="200"/>
+      </w:pPr>
+      <w:r>
+        <w:rPr>
+          <w:rFonts w:ascii="Calibri" w:cs="Calibri" w:eastAsia="Calibri" w:hAnsi="Calibri"/>
+          <w:b/>
+          <w:bCs/>
+          <w:color w:val="047857"/>
+          <w:sz w:val="18"/>
+          <w:szCs w:val="18"/>
+        </w:rPr>
+        <w:t xml:space="preserve">✂  COPY UP TO HERE</w:t>
+      </w:r>
+    </w:p>
+    <w:p>
+      <w:pPr>
+        <w:pStyle w:val="Heading2"/>
+        <w:spacing w:after="100" w:before="240"/>
+      </w:pPr>
+      <w:r>
+        <w:rPr>
+          <w:rFonts w:ascii="Calibri" w:cs="Calibri" w:eastAsia="Calibri" w:hAnsi="Calibri"/>
+          <w:b/>
+          <w:bCs/>
+          <w:color w:val="047857"/>
+          <w:sz w:val="23"/>
+          <w:szCs w:val="23"/>
+        </w:rPr>
+        <w:t xml:space="preserve">Grading enumeration, in short</w:t>
+      </w:r>
+    </w:p>
+    <w:p>
+      <w:pPr>
+        <w:pStyle w:val="ListParagraph"/>
+        <w:numPr>
+          <w:ilvl w:val="0"/>
+          <w:numId w:val="2"/>
+        </w:numPr>
+        <w:spacing w:after="40"/>
+      </w:pPr>
+      <w:r>
+        <w:rPr>
+          <w:rFonts w:ascii="Calibri" w:cs="Calibri" w:eastAsia="Calibri" w:hAnsi="Calibri"/>
+          <w:sz w:val="21"/>
+          <w:szCs w:val="21"/>
+        </w:rPr>
+        <w:t xml:space="preserve">Each correct item earns 1 point; a student who gets 2 of 3 earns 2 points.</w:t>
+      </w:r>
+    </w:p>
+    <w:p>
+      <w:pPr>
+        <w:pStyle w:val="ListParagraph"/>
+        <w:numPr>
+          <w:ilvl w:val="0"/>
+          <w:numId w:val="2"/>
+        </w:numPr>
+        <w:spacing w:after="40"/>
+      </w:pPr>
+      <w:r>
+        <w:rPr>
+          <w:rFonts w:ascii="Calibri" w:cs="Calibri" w:eastAsia="Calibri" w:hAnsi="Calibri"/>
+          <w:sz w:val="21"/>
+          <w:szCs w:val="21"/>
+        </w:rPr>
+        <w:t xml:space="preserve">Accepted wordings are separated by </w:t>
+      </w:r>
+      <w:r>
+        <w:rPr>
+          <w:rFonts w:ascii="Consolas" w:cs="Consolas" w:eastAsia="Consolas" w:hAnsi="Consolas"/>
+          <w:sz w:val="16"/>
+          <w:szCs w:val="16"/>
+        </w:rPr>
+        <w:t xml:space="preserve">/</w:t>
+      </w:r>
+      <w:r>
+        <w:rPr>
+          <w:rFonts w:ascii="Calibri" w:cs="Calibri" w:eastAsia="Calibri" w:hAnsi="Calibri"/>
+          <w:sz w:val="21"/>
+          <w:szCs w:val="21"/>
+        </w:rPr>
+        <w:t xml:space="preserve">; capital letters, extra spaces and a final period are ignored.</w:t>
+      </w:r>
+    </w:p>
+    <w:p>
+      <w:pPr>
+        <w:pStyle w:val="ListParagraph"/>
+        <w:numPr>
+          <w:ilvl w:val="0"/>
+          <w:numId w:val="2"/>
+        </w:numPr>
+        <w:spacing w:after="40"/>
+      </w:pPr>
+      <w:r>
+        <w:rPr>
+          <w:rFonts w:ascii="Calibri" w:cs="Calibri" w:eastAsia="Calibri" w:hAnsi="Calibri"/>
+          <w:sz w:val="21"/>
+          <w:szCs w:val="21"/>
+        </w:rPr>
+        <w:t xml:space="preserve">A wording you didn’t expect can be accepted by hand later in Exam → Check answers.</w:t>
       </w:r>
     </w:p>
     <w:sectPr>

</xml_diff>